<commit_message>
feat: add EmailModal component and integrate candidate email functionality into the dashboard
</commit_message>
<xml_diff>
--- a/backend/uploads/Anish1.docx
+++ b/backend/uploads/Anish1.docx
@@ -1,6 +1,6 @@
 
 <file path=word/document.xml><?xml version="1.0" encoding="utf-8"?>
-<w:document xmlns:wpc="http://schemas.microsoft.com/office/word/2010/wordprocessingCanvas" xmlns:cx="http://schemas.microsoft.com/office/drawing/2014/chartex" xmlns:cx1="http://schemas.microsoft.com/office/drawing/2015/9/8/chartex" xmlns:cx2="http://schemas.microsoft.com/office/drawing/2015/10/21/chartex" xmlns:cx3="http://schemas.microsoft.com/office/drawing/2016/5/9/chartex" xmlns:cx4="http://schemas.microsoft.com/office/drawing/2016/5/10/chartex" xmlns:cx5="http://schemas.microsoft.com/office/drawing/2016/5/11/chartex" xmlns:cx6="http://schemas.microsoft.com/office/drawing/2016/5/12/chartex" xmlns:cx7="http://schemas.microsoft.com/office/drawing/2016/5/13/chartex" xmlns:cx8="http://schemas.microsoft.com/office/drawing/2016/5/14/chartex" xmlns:mc="http://schemas.openxmlformats.org/markup-compatibility/2006" xmlns:aink="http://schemas.microsoft.com/office/drawing/2016/ink" xmlns:am3d="http://schemas.microsoft.com/office/drawing/2017/model3d" xmlns:o="urn:schemas-microsoft-com:office:office" xmlns:oel="http://schemas.microsoft.com/office/2019/extlst" xmlns:r="http://schemas.openxmlformats.org/officeDocument/2006/relationships" xmlns:m="http://schemas.openxmlformats.org/officeDocument/2006/math" xmlns:v="urn:schemas-microsoft-com:vml" xmlns:wp14="http://schemas.microsoft.com/office/word/2010/wordprocessingDrawing" xmlns:wp="http://schemas.openxmlformats.org/drawingml/2006/wordprocessingDrawing" xmlns:w10="urn:schemas-microsoft-com:office:word" xmlns:w="http://schemas.openxmlformats.org/wordprocessingml/2006/main" xmlns:w14="http://schemas.microsoft.com/office/word/2010/wordml" xmlns:w15="http://schemas.microsoft.com/office/word/2012/wordml" xmlns:w16cex="http://schemas.microsoft.com/office/word/2018/wordml/cex" xmlns:w16cid="http://schemas.microsoft.com/office/word/2016/wordml/cid" xmlns:w16="http://schemas.microsoft.com/office/word/2018/wordml" xmlns:w16du="http://schemas.microsoft.com/office/word/2023/wordml/word16du" xmlns:w16sdtdh="http://schemas.microsoft.com/office/word/2020/wordml/sdtdatahash" xmlns:w16sdtfl="http://schemas.microsoft.com/office/word/2024/wordml/sdtformatlock" xmlns:w16se="http://schemas.microsoft.com/office/word/2015/wordml/symex" xmlns:wpg="http://schemas.microsoft.com/office/word/2010/wordprocessingGroup" xmlns:wpi="http://schemas.microsoft.com/office/word/2010/wordprocessingInk" xmlns:wne="http://schemas.microsoft.com/office/word/2006/wordml" xmlns:wps="http://schemas.microsoft.com/office/word/2010/wordprocessingShape" mc:Ignorable="w14 w15 w16se w16cid w16 w16cex w16sdtdh w16sdtfl w16du wp14">
+<w:document xmlns:wpc="http://schemas.microsoft.com/office/word/2010/wordprocessingCanvas" xmlns:cx="http://schemas.microsoft.com/office/drawing/2014/chartex" xmlns:cx1="http://schemas.microsoft.com/office/drawing/2015/9/8/chartex" xmlns:cx2="http://schemas.microsoft.com/office/drawing/2015/10/21/chartex" xmlns:cx3="http://schemas.microsoft.com/office/drawing/2016/5/9/chartex" xmlns:cx4="http://schemas.microsoft.com/office/drawing/2016/5/10/chartex" xmlns:cx5="http://schemas.microsoft.com/office/drawing/2016/5/11/chartex" xmlns:cx6="http://schemas.microsoft.com/office/drawing/2016/5/12/chartex" xmlns:cx7="http://schemas.microsoft.com/office/drawing/2016/5/13/chartex" xmlns:cx8="http://schemas.microsoft.com/office/drawing/2016/5/14/chartex" xmlns:mc="http://schemas.openxmlformats.org/markup-compatibility/2006" xmlns:aink="http://schemas.microsoft.com/office/drawing/2016/ink" xmlns:am3d="http://schemas.microsoft.com/office/drawing/2017/model3d" xmlns:o="urn:schemas-microsoft-com:office:office" xmlns:oel="http://schemas.microsoft.com/office/2019/extlst" xmlns:r="http://schemas.openxmlformats.org/officeDocument/2006/relationships" xmlns:m="http://schemas.openxmlformats.org/officeDocument/2006/math" xmlns:v="urn:schemas-microsoft-com:vml" xmlns:wp14="http://schemas.microsoft.com/office/word/2010/wordprocessingDrawing" xmlns:wp="http://schemas.openxmlformats.org/drawingml/2006/wordprocessingDrawing" xmlns:w10="urn:schemas-microsoft-com:office:word" xmlns:w="http://schemas.openxmlformats.org/wordprocessingml/2006/main" xmlns:w14="http://schemas.microsoft.com/office/word/2010/wordml" xmlns:w15="http://schemas.microsoft.com/office/word/2012/wordml" xmlns:w16cex="http://schemas.microsoft.com/office/word/2018/wordml/cex" xmlns:w16cid="http://schemas.microsoft.com/office/word/2016/wordml/cid" xmlns:w16="http://schemas.microsoft.com/office/word/2018/wordml" xmlns:w16sdtdh="http://schemas.microsoft.com/office/word/2020/wordml/sdtdatahash" xmlns:w16se="http://schemas.microsoft.com/office/word/2015/wordml/symex" xmlns:wpg="http://schemas.microsoft.com/office/word/2010/wordprocessingGroup" xmlns:wpi="http://schemas.microsoft.com/office/word/2010/wordprocessingInk" xmlns:wne="http://schemas.microsoft.com/office/word/2006/wordml" xmlns:wps="http://schemas.microsoft.com/office/word/2010/wordprocessingShape" mc:Ignorable="w14 w15 w16se w16cid w16 w16cex w16sdtdh wp14">
   <w:body>
     <w:p>
       <w:pPr>
@@ -290,7 +290,6 @@
           <w:szCs w:val="28"/>
         </w:rPr>
       </w:pPr>
-      <w:proofErr w:type="gramStart"/>
       <w:r>
         <w:rPr>
           <w:sz w:val="28"/>
@@ -298,7 +297,6 @@
         </w:rPr>
         <w:t>Bachelor in Computer Engineering</w:t>
       </w:r>
-      <w:proofErr w:type="gramEnd"/>
     </w:p>
     <w:p>
       <w:pPr>
@@ -480,6 +478,55 @@
     </w:p>
     <w:p>
       <w:pPr>
+        <w:numPr>
+          <w:ilvl w:val="0"/>
+          <w:numId w:val="11"/>
+        </w:numPr>
+        <w:spacing w:after="163" w:line="259" w:lineRule="auto"/>
+        <w:rPr>
+          <w:sz w:val="28"/>
+          <w:szCs w:val="28"/>
+        </w:rPr>
+      </w:pPr>
+      <w:r>
+        <w:rPr>
+          <w:sz w:val="28"/>
+          <w:szCs w:val="28"/>
+        </w:rPr>
+        <w:t>Hindi (Proficient)</w:t>
+      </w:r>
+    </w:p>
+    <w:p>
+      <w:pPr>
+        <w:numPr>
+          <w:ilvl w:val="0"/>
+          <w:numId w:val="11"/>
+        </w:numPr>
+        <w:spacing w:after="163" w:line="259" w:lineRule="auto"/>
+        <w:rPr>
+          <w:sz w:val="28"/>
+          <w:szCs w:val="28"/>
+        </w:rPr>
+      </w:pPr>
+      <w:r>
+        <w:rPr>
+          <w:sz w:val="28"/>
+          <w:szCs w:val="28"/>
+        </w:rPr>
+        <w:t>Spanish (Proficient)</w:t>
+      </w:r>
+    </w:p>
+    <w:p>
+      <w:pPr>
+        <w:ind w:left="0" w:firstLine="0"/>
+        <w:rPr>
+          <w:sz w:val="28"/>
+          <w:szCs w:val="28"/>
+        </w:rPr>
+      </w:pPr>
+    </w:p>
+    <w:p>
+      <w:pPr>
         <w:ind w:left="0" w:firstLine="0"/>
         <w:rPr>
           <w:b/>
@@ -578,6 +625,7 @@
           <w:sz w:val="28"/>
           <w:szCs w:val="28"/>
         </w:rPr>
+        <w:lastRenderedPageBreak/>
         <w:t>Coding Challenges</w:t>
       </w:r>
     </w:p>
@@ -620,8 +668,121 @@
 </file>
 
 <file path=word/numbering.xml><?xml version="1.0" encoding="utf-8"?>
-<w:numbering xmlns:wpc="http://schemas.microsoft.com/office/word/2010/wordprocessingCanvas" xmlns:cx="http://schemas.microsoft.com/office/drawing/2014/chartex" xmlns:cx1="http://schemas.microsoft.com/office/drawing/2015/9/8/chartex" xmlns:cx2="http://schemas.microsoft.com/office/drawing/2015/10/21/chartex" xmlns:cx3="http://schemas.microsoft.com/office/drawing/2016/5/9/chartex" xmlns:cx4="http://schemas.microsoft.com/office/drawing/2016/5/10/chartex" xmlns:cx5="http://schemas.microsoft.com/office/drawing/2016/5/11/chartex" xmlns:cx6="http://schemas.microsoft.com/office/drawing/2016/5/12/chartex" xmlns:cx7="http://schemas.microsoft.com/office/drawing/2016/5/13/chartex" xmlns:cx8="http://schemas.microsoft.com/office/drawing/2016/5/14/chartex" xmlns:mc="http://schemas.openxmlformats.org/markup-compatibility/2006" xmlns:aink="http://schemas.microsoft.com/office/drawing/2016/ink" xmlns:am3d="http://schemas.microsoft.com/office/drawing/2017/model3d" xmlns:o="urn:schemas-microsoft-com:office:office" xmlns:oel="http://schemas.microsoft.com/office/2019/extlst" xmlns:r="http://schemas.openxmlformats.org/officeDocument/2006/relationships" xmlns:m="http://schemas.openxmlformats.org/officeDocument/2006/math" xmlns:v="urn:schemas-microsoft-com:vml" xmlns:wp14="http://schemas.microsoft.com/office/word/2010/wordprocessingDrawing" xmlns:wp="http://schemas.openxmlformats.org/drawingml/2006/wordprocessingDrawing" xmlns:w10="urn:schemas-microsoft-com:office:word" xmlns:w="http://schemas.openxmlformats.org/wordprocessingml/2006/main" xmlns:w14="http://schemas.microsoft.com/office/word/2010/wordml" xmlns:w15="http://schemas.microsoft.com/office/word/2012/wordml" xmlns:w16cex="http://schemas.microsoft.com/office/word/2018/wordml/cex" xmlns:w16cid="http://schemas.microsoft.com/office/word/2016/wordml/cid" xmlns:w16="http://schemas.microsoft.com/office/word/2018/wordml" xmlns:w16du="http://schemas.microsoft.com/office/word/2023/wordml/word16du" xmlns:w16sdtdh="http://schemas.microsoft.com/office/word/2020/wordml/sdtdatahash" xmlns:w16sdtfl="http://schemas.microsoft.com/office/word/2024/wordml/sdtformatlock" xmlns:w16se="http://schemas.microsoft.com/office/word/2015/wordml/symex" xmlns:wpg="http://schemas.microsoft.com/office/word/2010/wordprocessingGroup" xmlns:wpi="http://schemas.microsoft.com/office/word/2010/wordprocessingInk" xmlns:wne="http://schemas.microsoft.com/office/word/2006/wordml" xmlns:wps="http://schemas.microsoft.com/office/word/2010/wordprocessingShape" mc:Ignorable="w14 w15 w16se w16cid w16 w16cex w16sdtdh w16sdtfl w16du wp14">
+<w:numbering xmlns:wpc="http://schemas.microsoft.com/office/word/2010/wordprocessingCanvas" xmlns:cx="http://schemas.microsoft.com/office/drawing/2014/chartex" xmlns:cx1="http://schemas.microsoft.com/office/drawing/2015/9/8/chartex" xmlns:cx2="http://schemas.microsoft.com/office/drawing/2015/10/21/chartex" xmlns:cx3="http://schemas.microsoft.com/office/drawing/2016/5/9/chartex" xmlns:cx4="http://schemas.microsoft.com/office/drawing/2016/5/10/chartex" xmlns:cx5="http://schemas.microsoft.com/office/drawing/2016/5/11/chartex" xmlns:cx6="http://schemas.microsoft.com/office/drawing/2016/5/12/chartex" xmlns:cx7="http://schemas.microsoft.com/office/drawing/2016/5/13/chartex" xmlns:cx8="http://schemas.microsoft.com/office/drawing/2016/5/14/chartex" xmlns:mc="http://schemas.openxmlformats.org/markup-compatibility/2006" xmlns:aink="http://schemas.microsoft.com/office/drawing/2016/ink" xmlns:am3d="http://schemas.microsoft.com/office/drawing/2017/model3d" xmlns:o="urn:schemas-microsoft-com:office:office" xmlns:oel="http://schemas.microsoft.com/office/2019/extlst" xmlns:r="http://schemas.openxmlformats.org/officeDocument/2006/relationships" xmlns:m="http://schemas.openxmlformats.org/officeDocument/2006/math" xmlns:v="urn:schemas-microsoft-com:vml" xmlns:wp14="http://schemas.microsoft.com/office/word/2010/wordprocessingDrawing" xmlns:wp="http://schemas.openxmlformats.org/drawingml/2006/wordprocessingDrawing" xmlns:w10="urn:schemas-microsoft-com:office:word" xmlns:w="http://schemas.openxmlformats.org/wordprocessingml/2006/main" xmlns:w14="http://schemas.microsoft.com/office/word/2010/wordml" xmlns:w15="http://schemas.microsoft.com/office/word/2012/wordml" xmlns:w16cex="http://schemas.microsoft.com/office/word/2018/wordml/cex" xmlns:w16cid="http://schemas.microsoft.com/office/word/2016/wordml/cid" xmlns:w16="http://schemas.microsoft.com/office/word/2018/wordml" xmlns:w16sdtdh="http://schemas.microsoft.com/office/word/2020/wordml/sdtdatahash" xmlns:w16se="http://schemas.microsoft.com/office/word/2015/wordml/symex" xmlns:wpg="http://schemas.microsoft.com/office/word/2010/wordprocessingGroup" xmlns:wpi="http://schemas.microsoft.com/office/word/2010/wordprocessingInk" xmlns:wne="http://schemas.microsoft.com/office/word/2006/wordml" xmlns:wps="http://schemas.microsoft.com/office/word/2010/wordprocessingShape" mc:Ignorable="w14 w15 w16se w16cid w16 w16cex w16sdtdh wp14">
   <w:abstractNum w:abstractNumId="0" w15:restartNumberingAfterBreak="0">
+    <w:nsid w:val="0A6C7A82"/>
+    <w:multiLevelType w:val="multilevel"/>
+    <w:tmpl w:val="3378E206"/>
+    <w:lvl w:ilvl="0">
+      <w:start w:val="1"/>
+      <w:numFmt w:val="decimal"/>
+      <w:lvlText w:val="%1."/>
+      <w:lvlJc w:val="left"/>
+      <w:pPr>
+        <w:tabs>
+          <w:tab w:val="num" w:pos="720"/>
+        </w:tabs>
+        <w:ind w:left="720" w:hanging="360"/>
+      </w:pPr>
+    </w:lvl>
+    <w:lvl w:ilvl="1" w:tentative="1">
+      <w:start w:val="1"/>
+      <w:numFmt w:val="decimal"/>
+      <w:lvlText w:val="%2."/>
+      <w:lvlJc w:val="left"/>
+      <w:pPr>
+        <w:tabs>
+          <w:tab w:val="num" w:pos="1440"/>
+        </w:tabs>
+        <w:ind w:left="1440" w:hanging="360"/>
+      </w:pPr>
+    </w:lvl>
+    <w:lvl w:ilvl="2" w:tentative="1">
+      <w:start w:val="1"/>
+      <w:numFmt w:val="decimal"/>
+      <w:lvlText w:val="%3."/>
+      <w:lvlJc w:val="left"/>
+      <w:pPr>
+        <w:tabs>
+          <w:tab w:val="num" w:pos="2160"/>
+        </w:tabs>
+        <w:ind w:left="2160" w:hanging="360"/>
+      </w:pPr>
+    </w:lvl>
+    <w:lvl w:ilvl="3" w:tentative="1">
+      <w:start w:val="1"/>
+      <w:numFmt w:val="decimal"/>
+      <w:lvlText w:val="%4."/>
+      <w:lvlJc w:val="left"/>
+      <w:pPr>
+        <w:tabs>
+          <w:tab w:val="num" w:pos="2880"/>
+        </w:tabs>
+        <w:ind w:left="2880" w:hanging="360"/>
+      </w:pPr>
+    </w:lvl>
+    <w:lvl w:ilvl="4" w:tentative="1">
+      <w:start w:val="1"/>
+      <w:numFmt w:val="decimal"/>
+      <w:lvlText w:val="%5."/>
+      <w:lvlJc w:val="left"/>
+      <w:pPr>
+        <w:tabs>
+          <w:tab w:val="num" w:pos="3600"/>
+        </w:tabs>
+        <w:ind w:left="3600" w:hanging="360"/>
+      </w:pPr>
+    </w:lvl>
+    <w:lvl w:ilvl="5" w:tentative="1">
+      <w:start w:val="1"/>
+      <w:numFmt w:val="decimal"/>
+      <w:lvlText w:val="%6."/>
+      <w:lvlJc w:val="left"/>
+      <w:pPr>
+        <w:tabs>
+          <w:tab w:val="num" w:pos="4320"/>
+        </w:tabs>
+        <w:ind w:left="4320" w:hanging="360"/>
+      </w:pPr>
+    </w:lvl>
+    <w:lvl w:ilvl="6" w:tentative="1">
+      <w:start w:val="1"/>
+      <w:numFmt w:val="decimal"/>
+      <w:lvlText w:val="%7."/>
+      <w:lvlJc w:val="left"/>
+      <w:pPr>
+        <w:tabs>
+          <w:tab w:val="num" w:pos="5040"/>
+        </w:tabs>
+        <w:ind w:left="5040" w:hanging="360"/>
+      </w:pPr>
+    </w:lvl>
+    <w:lvl w:ilvl="7" w:tentative="1">
+      <w:start w:val="1"/>
+      <w:numFmt w:val="decimal"/>
+      <w:lvlText w:val="%8."/>
+      <w:lvlJc w:val="left"/>
+      <w:pPr>
+        <w:tabs>
+          <w:tab w:val="num" w:pos="5760"/>
+        </w:tabs>
+        <w:ind w:left="5760" w:hanging="360"/>
+      </w:pPr>
+    </w:lvl>
+    <w:lvl w:ilvl="8" w:tentative="1">
+      <w:start w:val="1"/>
+      <w:numFmt w:val="decimal"/>
+      <w:lvlText w:val="%9."/>
+      <w:lvlJc w:val="left"/>
+      <w:pPr>
+        <w:tabs>
+          <w:tab w:val="num" w:pos="6480"/>
+        </w:tabs>
+        <w:ind w:left="6480" w:hanging="360"/>
+      </w:pPr>
+    </w:lvl>
+  </w:abstractNum>
+  <w:abstractNum w:abstractNumId="1" w15:restartNumberingAfterBreak="0">
     <w:nsid w:val="108D2AEE"/>
     <w:multiLevelType w:val="hybridMultilevel"/>
     <w:tmpl w:val="503C9092"/>
@@ -833,7 +994,7 @@
       </w:rPr>
     </w:lvl>
   </w:abstractNum>
-  <w:abstractNum w:abstractNumId="1" w15:restartNumberingAfterBreak="0">
+  <w:abstractNum w:abstractNumId="2" w15:restartNumberingAfterBreak="0">
     <w:nsid w:val="21365CD0"/>
     <w:multiLevelType w:val="multilevel"/>
     <w:tmpl w:val="DAB878E6"/>
@@ -946,7 +1107,7 @@
       </w:pPr>
     </w:lvl>
   </w:abstractNum>
-  <w:abstractNum w:abstractNumId="2" w15:restartNumberingAfterBreak="0">
+  <w:abstractNum w:abstractNumId="3" w15:restartNumberingAfterBreak="0">
     <w:nsid w:val="24CA2362"/>
     <w:multiLevelType w:val="hybridMultilevel"/>
     <w:tmpl w:val="59885108"/>
@@ -1158,7 +1319,7 @@
       </w:rPr>
     </w:lvl>
   </w:abstractNum>
-  <w:abstractNum w:abstractNumId="3" w15:restartNumberingAfterBreak="0">
+  <w:abstractNum w:abstractNumId="4" w15:restartNumberingAfterBreak="0">
     <w:nsid w:val="26F53D84"/>
     <w:multiLevelType w:val="hybridMultilevel"/>
     <w:tmpl w:val="4C6AE2CE"/>
@@ -1370,7 +1531,7 @@
       </w:rPr>
     </w:lvl>
   </w:abstractNum>
-  <w:abstractNum w:abstractNumId="4" w15:restartNumberingAfterBreak="0">
+  <w:abstractNum w:abstractNumId="5" w15:restartNumberingAfterBreak="0">
     <w:nsid w:val="275768ED"/>
     <w:multiLevelType w:val="hybridMultilevel"/>
     <w:tmpl w:val="112C0FC8"/>
@@ -1582,7 +1743,7 @@
       </w:rPr>
     </w:lvl>
   </w:abstractNum>
-  <w:abstractNum w:abstractNumId="5" w15:restartNumberingAfterBreak="0">
+  <w:abstractNum w:abstractNumId="6" w15:restartNumberingAfterBreak="0">
     <w:nsid w:val="3D0C483B"/>
     <w:multiLevelType w:val="hybridMultilevel"/>
     <w:tmpl w:val="7D4AFA18"/>
@@ -1803,7 +1964,7 @@
       </w:rPr>
     </w:lvl>
   </w:abstractNum>
-  <w:abstractNum w:abstractNumId="6" w15:restartNumberingAfterBreak="0">
+  <w:abstractNum w:abstractNumId="7" w15:restartNumberingAfterBreak="0">
     <w:nsid w:val="3E3A0A25"/>
     <w:multiLevelType w:val="multilevel"/>
     <w:tmpl w:val="CCE06342"/>
@@ -1916,7 +2077,7 @@
       </w:pPr>
     </w:lvl>
   </w:abstractNum>
-  <w:abstractNum w:abstractNumId="7" w15:restartNumberingAfterBreak="0">
+  <w:abstractNum w:abstractNumId="8" w15:restartNumberingAfterBreak="0">
     <w:nsid w:val="3EAE5407"/>
     <w:multiLevelType w:val="multilevel"/>
     <w:tmpl w:val="A53C59B2"/>
@@ -2029,7 +2190,7 @@
       </w:pPr>
     </w:lvl>
   </w:abstractNum>
-  <w:abstractNum w:abstractNumId="8" w15:restartNumberingAfterBreak="0">
+  <w:abstractNum w:abstractNumId="9" w15:restartNumberingAfterBreak="0">
     <w:nsid w:val="4C9E0803"/>
     <w:multiLevelType w:val="multilevel"/>
     <w:tmpl w:val="07DCC4FE"/>
@@ -2142,7 +2303,7 @@
       </w:pPr>
     </w:lvl>
   </w:abstractNum>
-  <w:abstractNum w:abstractNumId="9" w15:restartNumberingAfterBreak="0">
+  <w:abstractNum w:abstractNumId="10" w15:restartNumberingAfterBreak="0">
     <w:nsid w:val="65BD5153"/>
     <w:multiLevelType w:val="hybridMultilevel"/>
     <w:tmpl w:val="2BE420CC"/>
@@ -2354,7 +2515,7 @@
       </w:rPr>
     </w:lvl>
   </w:abstractNum>
-  <w:abstractNum w:abstractNumId="10" w15:restartNumberingAfterBreak="0">
+  <w:abstractNum w:abstractNumId="11" w15:restartNumberingAfterBreak="0">
     <w:nsid w:val="69541B92"/>
     <w:multiLevelType w:val="hybridMultilevel"/>
     <w:tmpl w:val="AD564962"/>
@@ -2440,7 +2601,7 @@
       </w:pPr>
     </w:lvl>
   </w:abstractNum>
-  <w:abstractNum w:abstractNumId="11" w15:restartNumberingAfterBreak="0">
+  <w:abstractNum w:abstractNumId="12" w15:restartNumberingAfterBreak="0">
     <w:nsid w:val="769457B6"/>
     <w:multiLevelType w:val="multilevel"/>
     <w:tmpl w:val="317CDEA2"/>
@@ -2554,46 +2715,49 @@
     </w:lvl>
   </w:abstractNum>
   <w:num w:numId="1" w16cid:durableId="473134753">
+    <w:abstractNumId w:val="6"/>
+  </w:num>
+  <w:num w:numId="2" w16cid:durableId="1143236907">
     <w:abstractNumId w:val="5"/>
   </w:num>
-  <w:num w:numId="2" w16cid:durableId="1143236907">
+  <w:num w:numId="3" w16cid:durableId="1491866042">
+    <w:abstractNumId w:val="3"/>
+  </w:num>
+  <w:num w:numId="4" w16cid:durableId="14356892">
     <w:abstractNumId w:val="4"/>
   </w:num>
-  <w:num w:numId="3" w16cid:durableId="1491866042">
+  <w:num w:numId="5" w16cid:durableId="2141066544">
+    <w:abstractNumId w:val="10"/>
+  </w:num>
+  <w:num w:numId="6" w16cid:durableId="2087914796">
+    <w:abstractNumId w:val="1"/>
+  </w:num>
+  <w:num w:numId="7" w16cid:durableId="1806388158">
+    <w:abstractNumId w:val="11"/>
+  </w:num>
+  <w:num w:numId="8" w16cid:durableId="792094459">
+    <w:abstractNumId w:val="7"/>
+  </w:num>
+  <w:num w:numId="9" w16cid:durableId="1175802569">
+    <w:abstractNumId w:val="12"/>
+  </w:num>
+  <w:num w:numId="10" w16cid:durableId="1331368505">
     <w:abstractNumId w:val="2"/>
   </w:num>
-  <w:num w:numId="4" w16cid:durableId="14356892">
-    <w:abstractNumId w:val="3"/>
-  </w:num>
-  <w:num w:numId="5" w16cid:durableId="2141066544">
+  <w:num w:numId="11" w16cid:durableId="1882476093">
     <w:abstractNumId w:val="9"/>
   </w:num>
-  <w:num w:numId="6" w16cid:durableId="2087914796">
-    <w:abstractNumId w:val="0"/>
-  </w:num>
-  <w:num w:numId="7" w16cid:durableId="1806388158">
-    <w:abstractNumId w:val="10"/>
-  </w:num>
-  <w:num w:numId="8" w16cid:durableId="792094459">
-    <w:abstractNumId w:val="6"/>
-  </w:num>
-  <w:num w:numId="9" w16cid:durableId="1175802569">
-    <w:abstractNumId w:val="11"/>
-  </w:num>
-  <w:num w:numId="10" w16cid:durableId="1331368505">
-    <w:abstractNumId w:val="1"/>
-  </w:num>
-  <w:num w:numId="11" w16cid:durableId="1882476093">
+  <w:num w:numId="12" w16cid:durableId="777914611">
     <w:abstractNumId w:val="8"/>
   </w:num>
-  <w:num w:numId="12" w16cid:durableId="777914611">
-    <w:abstractNumId w:val="7"/>
+  <w:num w:numId="13" w16cid:durableId="1087270835">
+    <w:abstractNumId w:val="0"/>
   </w:num>
 </w:numbering>
 </file>
 
 <file path=word/styles.xml><?xml version="1.0" encoding="utf-8"?>
-<w:styles xmlns:mc="http://schemas.openxmlformats.org/markup-compatibility/2006" xmlns:r="http://schemas.openxmlformats.org/officeDocument/2006/relationships" xmlns:w="http://schemas.openxmlformats.org/wordprocessingml/2006/main" xmlns:w14="http://schemas.microsoft.com/office/word/2010/wordml" xmlns:w15="http://schemas.microsoft.com/office/word/2012/wordml" xmlns:w16cex="http://schemas.microsoft.com/office/word/2018/wordml/cex" xmlns:w16cid="http://schemas.microsoft.com/office/word/2016/wordml/cid" xmlns:w16="http://schemas.microsoft.com/office/word/2018/wordml" xmlns:w16du="http://schemas.microsoft.com/office/word/2023/wordml/word16du" xmlns:w16sdtdh="http://schemas.microsoft.com/office/word/2020/wordml/sdtdatahash" xmlns:w16sdtfl="http://schemas.microsoft.com/office/word/2024/wordml/sdtformatlock" xmlns:w16se="http://schemas.microsoft.com/office/word/2015/wordml/symex" mc:Ignorable="w14 w15 w16se w16cid w16 w16cex w16sdtdh w16sdtfl w16du">
+<w:styles xmlns:mc="http://schemas.openxmlformats.org/markup-compatibility/2006" xmlns:r="http://schemas.openxmlformats.org/officeDocument/2006/relationships" xmlns:w="http://schemas.openxmlformats.org/wordprocessingml/2006/main" xmlns:w14="http://schemas.microsoft.com/office/word/2010/wordml" xmlns:w15="http://schemas.microsoft.com/office/word/2012/wordml" xmlns:w16cex="http://schemas.microsoft.com/office/word/2018/wordml/cex" xmlns:w16cid="http://schemas.microsoft.com/office/word/2016/wordml/cid" xmlns:w16="http://schemas.microsoft.com/office/word/2018/wordml" xmlns:w16sdtdh="http://schemas.microsoft.com/office/word/2020/wordml/sdtdatahash" xmlns:w16se="http://schemas.microsoft.com/office/word/2015/wordml/symex" mc:Ignorable="w14 w15 w16se w16cid w16 w16cex w16sdtdh">
   <w:docDefaults>
     <w:rPrDefault>
       <w:rPr>
@@ -3002,6 +3166,7 @@
   <w:style w:type="character" w:default="1" w:styleId="DefaultParagraphFont">
     <w:name w:val="Default Paragraph Font"/>
     <w:uiPriority w:val="1"/>
+    <w:semiHidden/>
     <w:unhideWhenUsed/>
   </w:style>
   <w:style w:type="table" w:default="1" w:styleId="TableNormal">

</xml_diff>